<commit_message>
Antigravity: 1. Girişteki Yemin ile Metindeki "Battery / Motherboard" K…
</commit_message>
<xml_diff>
--- a/docs/planli_eskitme_hitabet_metni_en.docx
+++ b/docs/planli_eskitme_hitabet_metni_en.docx
@@ -41,7 +41,7 @@
           <w:i w:val="0"/>
           <w:sz w:val="22"/>
         </w:rPr>
-        <w:t xml:space="preserve">I will not begin by pointing to specific consumer gadgets. Mention a particular battery, an interchangeable circuit board, or an encrypted software update, and our discourse is immediately hijacked by the peculiar physics and transient regulations of that single artifact. The universal principle is lost. We must proceed as classical jurists have always proceeded: through </w:t>
+        <w:t xml:space="preserve">We proceed through the classical juristic method of </w:t>
       </w:r>
       <w:r>
         <w:rPr>
@@ -59,7 +59,7 @@
           <w:i w:val="0"/>
           <w:sz w:val="22"/>
         </w:rPr>
-        <w:t>—the deliberate isolation of the operative legal ground. We strip away the corporate trademark, the product category, and the transient hardware shell. What remains is the naked reality of the transaction: an economic architecture governed by asymmetric power, strict delictual liability, and objective normative variables. Every argument I present rests squarely upon this foundation.</w:t>
+        <w:t>—the deliberate isolation of the operative legal ground. Stripping away corporate trademarks, transient hardware shells, and specific product categories, our inquiry fastens directly upon the underlying reality of the transaction: an economic architecture governed by asymmetric power, strict delictual liability, and objective normative variables. Every argument I present rests squarely upon this universal foundation.</w:t>
       </w:r>
     </w:p>
     <w:p>
@@ -1105,7 +1105,7 @@
           <w:i w:val="0"/>
           <w:sz w:val="22"/>
         </w:rPr>
-        <w:t xml:space="preserve">In an open, competitive market, premature failure would drive the customer straight to a rival. To prevent this escape, the maker builds proprietary moats: exclusive cables, non-standard connectors, and locked data formats. When the good fails prematurely, the captive consumer cannot switch without abandoning substantial invested capital. The manufacturer reaps accelerated replacement revenue derived entirely from the buyer's artificial vulnerability. Article 19 of the Mecelle establishes that injury must be eliminated. More crucially, Article 99 codifies a universal principle: </w:t>
+        <w:t xml:space="preserve">In an open, competitive market, premature failure would drive the customer straight to a rival. To prevent this escape, the maker builds proprietary moats: proprietary physical interfaces, non-standard interconnects, and locked data formats. When the good fails prematurely, the captive consumer cannot switch without abandoning substantial invested capital. The manufacturer reaps accelerated replacement revenue derived entirely from the buyer's artificial vulnerability. Article 19 of the Mecelle establishes that injury must be eliminated. More crucially, Article 99 codifies a universal principle: </w:t>
       </w:r>
       <w:r>
         <w:rPr>
@@ -1315,7 +1315,7 @@
           <w:i w:val="0"/>
           <w:sz w:val="22"/>
         </w:rPr>
-        <w:t>Picture what happens in daily life. A small, inexpensive sub-assembly reaches the end of its chemical cycle. The foundation of the machine—the motherboard, the chassis, the display—is completely intact. A local technician, or indeed the owner themselves, could slide in a fresh, standardized replacement within minutes, with zero compromise to safety. But the manufacturer locks the door: diagnostic protocols are hidden under commercial secrecy, calibration routines are withheld, and cryptographic serialization codes are programmed into the silicon to reject any part not blessed by corporate headquarters.</w:t>
+        <w:t>Consider the operational reality: a subordinate, naturally perishable sub-assembly reaches the end of its functional cycle, while the primary architecture of the asset—its structural frame, main compute core, and primary output interface—remains completely sound and intact. A qualified technician, or indeed the owner themselves, could install a standardized replacement within minutes, with zero compromise to systemic safety. But the manufacturer locks the door: diagnostic protocols are hidden under commercial secrecy, calibration routines are withheld, and cryptographic serialization codes are programmed into the hardware to reject any component not blessed by corporate headquarters.</w:t>
       </w:r>
     </w:p>
     <w:p>
@@ -2215,7 +2215,7 @@
           <w:i w:val="0"/>
           <w:sz w:val="22"/>
         </w:rPr>
-        <w:t>Second, the defense of necessity: "We had no alternative. We intervened to protect system stability, battery safety, and regulatory compliance."</w:t>
+        <w:t>Second, the defense of necessity: "We had no alternative. We intervened to protect system stability, sub-component safety, and regulatory compliance."</w:t>
       </w:r>
     </w:p>
     <w:p>
@@ -2247,7 +2247,7 @@
           <w:i w:val="0"/>
           <w:sz w:val="22"/>
         </w:rPr>
-        <w:t xml:space="preserve">) into an absolute shield. But the law rejects false dilemmas. Necessity is strictly bounded by proportionality under Article 22 of the Mecelle. When a minor internal battery exhausts, that localized wear does not give the manufacturer license to throttle the entire system and force the customer into buying a new machine. More decisively, Article 33 of the Mecelle establishes an unbending rule: </w:t>
+        <w:t xml:space="preserve">) into an absolute shield. But the law rejects false dilemmas. Necessity is strictly bounded by proportionality under Article 22 of the Mecelle. When a subordinate internal consumable reaches natural fatigue, that localized exhaustion does not give the manufacturer license to throttle the entire system and force the customer into buying a replacement. More decisively, Article 33 of the Mecelle establishes an unbending rule: </w:t>
       </w:r>
       <w:r>
         <w:rPr>
@@ -2265,7 +2265,7 @@
           <w:i w:val="0"/>
           <w:sz w:val="22"/>
         </w:rPr>
-        <w:t>—necessity does not extinguish the vested property right of another. If an authentic hazard arises, the maker must issue transparent notices, provide replacement components at reasonable cost, and restore the device to sound operation. Packaging commercial obsolescence as safety is not engineering; it is corporate subterfuge masquerading as necessity.</w:t>
+        <w:t>—necessity does not extinguish the vested property right of another. If an authentic operational hazard arises, the maker must issue transparent notices, provide replacement components at reasonable cost, and restore the device to sound operation. Packaging commercial obsolescence as safety is not engineering; it is corporate subterfuge masquerading as necessity.</w:t>
       </w:r>
     </w:p>
     <w:p>
@@ -2579,7 +2579,7 @@
           <w:i w:val="0"/>
           <w:sz w:val="22"/>
         </w:rPr>
-        <w:t>. That ecological crime completely invalidates the liability disclaimers companies slip into fine print, giving public magistrates full warrant to order restitution and punitive remedies. You cannot wash this clean by wrapping it in the polite language of software licenses, battery safety, or corporate innovation; doing so only layers hypocrisy on top of injustice.</w:t>
+        <w:t>. That ecological crime completely invalidates the liability disclaimers companies slip into fine print, giving public magistrates full warrant to order restitution and punitive remedies. You cannot wash this clean by wrapping it in the polite language of software licenses, component safety, or corporate innovation; doing so only layers hypocrisy on top of injustice.</w:t>
       </w:r>
     </w:p>
     <w:p>
@@ -2593,7 +2593,7 @@
           <w:i w:val="0"/>
           <w:sz w:val="22"/>
         </w:rPr>
-        <w:t>What then is the mandate for manufacturers, software architects, and platform designers? The standard of justice could not be simpler. When your hardware genuinely encounters its computational horizon, state that truth openly, leave the legacy software unmolested, and surrender the cryptographic keys so owners can run their property locally. If an authentic battery hazard emerges, issue a public recall notice and supply modular replacements under the proportionality rule of Article 22 of the Mecelle, rather than sabotaging the device from afar. And if system integrity demands security verification, implement open and verifiable attestation rather than proprietary locks designed to extinguish independent repair.</w:t>
+        <w:t>What then is the mandate for manufacturers, software architects, and platform designers? The standard of justice could not be simpler. When your hardware genuinely encounters its computational horizon, state that truth openly, leave the legacy software unmolested, and surrender the cryptographic keys so owners can run their property locally. If an authentic component hazard emerges, issue a public recall notice and supply modular replacements under the proportionality rule of Article 22 of the Mecelle, rather than sabotaging the device from afar. And if system integrity demands security verification, implement open and verifiable attestation rather than proprietary locks designed to extinguish independent repair.</w:t>
       </w:r>
     </w:p>
     <w:p>

</xml_diff>